<commit_message>
Ship Help docs and bump dashboard submodule.
Refresh USER_MANUAL for Help-without-guild/paywall notes and point at the dashboard Help + Word manual release.

Co-authored-by: Cursor <cursoragent@cursor.com>
</commit_message>
<xml_diff>
--- a/UnderbossHQ-User-Manual.docx
+++ b/UnderbossHQ-User-Manual.docx
@@ -48,7 +48,7 @@
       <w:r>
         <w:t xml:space="preserve"> </w:t>
       </w:r>
-      <w:hyperlink w:history="1" r:id="rIdc7euixvvwb4qmjhfaxlcn">
+      <w:hyperlink w:history="1" r:id="rIdaq1gawbv3cfh3bfvpnrqd">
         <w:r>
           <w:rPr>
             <w:color w:val="8B0018"/>
@@ -57,6 +57,78 @@
           <w:t xml:space="preserve">https://underbosshq-two.vercel.app</w:t>
         </w:r>
       </w:hyperlink>
+    </w:p>
+    <w:p>
+      <w:pPr>
+        <w:spacing w:after="160"/>
+      </w:pPr>
+      <w:r>
+        <w:rPr>
+          <w:b/>
+          <w:bCs/>
+        </w:rPr>
+        <w:t xml:space="preserve">Download:</w:t>
+      </w:r>
+      <w:r>
+        <w:t xml:space="preserve"> </w:t>
+      </w:r>
+      <w:hyperlink w:history="1" r:id="rId34ylzqqjstl_j_fy81av3">
+        <w:r>
+          <w:rPr>
+            <w:color w:val="8B0018"/>
+            <w:u w:val="single"/>
+          </w:rPr>
+          <w:t xml:space="preserve">UnderbossHQ-User-Manual.docx</w:t>
+        </w:r>
+      </w:hyperlink>
+    </w:p>
+    <w:p>
+      <w:pPr>
+        <w:spacing w:after="160"/>
+      </w:pPr>
+      <w:r>
+        <w:rPr>
+          <w:b/>
+          <w:bCs/>
+        </w:rPr>
+        <w:t xml:space="preserve">In the app:</w:t>
+      </w:r>
+      <w:r>
+        <w:t xml:space="preserve"> open </w:t>
+      </w:r>
+      <w:r>
+        <w:rPr>
+          <w:b/>
+          <w:bCs/>
+        </w:rPr>
+        <w:t xml:space="preserve">Help</w:t>
+      </w:r>
+      <w:r>
+        <w:t xml:space="preserve"> in the sidebar (</w:t>
+      </w:r>
+      <w:r>
+        <w:rPr>
+          <w:rFonts w:ascii="Consolas" w:cs="Consolas" w:eastAsia="Consolas" w:hAnsi="Consolas"/>
+        </w:rPr>
+        <w:t xml:space="preserve">/help</w:t>
+      </w:r>
+      <w:r>
+        <w:t xml:space="preserve">) for the same guide online.</w:t>
+      </w:r>
+    </w:p>
+    <w:p>
+      <w:pPr>
+        <w:spacing w:after="160"/>
+      </w:pPr>
+      <w:r>
+        <w:t xml:space="preserve">To rebuild the Word file after editing this markdown: </w:t>
+      </w:r>
+      <w:r>
+        <w:rPr>
+          <w:rFonts w:ascii="Consolas" w:cs="Consolas" w:eastAsia="Consolas" w:hAnsi="Consolas"/>
+        </w:rPr>
+        <w:t xml:space="preserve">cd dashboard &amp;&amp; npm run build:manual</w:t>
+      </w:r>
     </w:p>
     <w:p>
       <w:pPr>
@@ -1071,7 +1143,35 @@
         <w:t xml:space="preserve">Translator</w:t>
       </w:r>
       <w:r>
-        <w:t xml:space="preserve"> — floating button (🌐) for quick text translation (when premium/access allows)</w:t>
+        <w:t xml:space="preserve"> — floating button (🌐) for quick text translation (when premium/access allows)  </w:t>
+      </w:r>
+    </w:p>
+    <w:p>
+      <w:pPr>
+        <w:spacing w:after="80"/>
+        <w:ind w:left="360"/>
+      </w:pPr>
+      <w:r>
+        <w:t xml:space="preserve">• </w:t>
+      </w:r>
+      <w:r>
+        <w:rPr>
+          <w:b/>
+          <w:bCs/>
+        </w:rPr>
+        <w:t xml:space="preserve">Help</w:t>
+      </w:r>
+      <w:r>
+        <w:t xml:space="preserve"> — this guide at </w:t>
+      </w:r>
+      <w:r>
+        <w:rPr>
+          <w:rFonts w:ascii="Consolas" w:cs="Consolas" w:eastAsia="Consolas" w:hAnsi="Consolas"/>
+        </w:rPr>
+        <w:t xml:space="preserve">/help</w:t>
+      </w:r>
+      <w:r>
+        <w:t xml:space="preserve"> (also available before picking a server, and behind the premium paywall)</w:t>
       </w:r>
     </w:p>
     <w:p>
@@ -2825,7 +2925,7 @@
       <w:r>
         <w:t xml:space="preserve">• </w:t>
       </w:r>
-      <w:hyperlink w:history="1" r:id="rIdxcggtvvzt-4iyjowxvhfh">
+      <w:hyperlink w:history="1" r:id="rId1xwl_ye6vikhvshzokqkq">
         <w:r>
           <w:rPr>
             <w:color w:val="8B0018"/>
@@ -2846,7 +2946,7 @@
       <w:r>
         <w:t xml:space="preserve">• </w:t>
       </w:r>
-      <w:hyperlink w:history="1" r:id="rId1uskwab2zjopnz-z-u9rc">
+      <w:hyperlink w:history="1" r:id="rId0vomppbjf2xfmg1zif6lb">
         <w:r>
           <w:rPr>
             <w:color w:val="8B0018"/>
@@ -2858,6 +2958,62 @@
       <w:r>
         <w:t xml:space="preserve"> (in the dashboard)  </w:t>
       </w:r>
+    </w:p>
+    <w:p>
+      <w:pPr>
+        <w:spacing w:after="80"/>
+        <w:ind w:left="360"/>
+      </w:pPr>
+      <w:r>
+        <w:t xml:space="preserve">• </w:t>
+      </w:r>
+      <w:r>
+        <w:rPr>
+          <w:b/>
+          <w:bCs/>
+        </w:rPr>
+        <w:t xml:space="preserve">Help</w:t>
+      </w:r>
+      <w:r>
+        <w:t xml:space="preserve"> — in-app guide at </w:t>
+      </w:r>
+      <w:r>
+        <w:rPr>
+          <w:rFonts w:ascii="Consolas" w:cs="Consolas" w:eastAsia="Consolas" w:hAnsi="Consolas"/>
+        </w:rPr>
+        <w:t xml:space="preserve">/help</w:t>
+      </w:r>
+      <w:r>
+        <w:t xml:space="preserve">  </w:t>
+      </w:r>
+    </w:p>
+    <w:p>
+      <w:pPr>
+        <w:spacing w:after="80"/>
+        <w:ind w:left="360"/>
+      </w:pPr>
+      <w:r>
+        <w:t xml:space="preserve">• </w:t>
+      </w:r>
+      <w:r>
+        <w:rPr>
+          <w:b/>
+          <w:bCs/>
+        </w:rPr>
+        <w:t xml:space="preserve">Download User Manual</w:t>
+      </w:r>
+      <w:r>
+        <w:t xml:space="preserve"> — Word file from the login page, Help page, or </w:t>
+      </w:r>
+      <w:hyperlink w:history="1" r:id="rIdt-5w_4rojvnqycvn3wkby">
+        <w:r>
+          <w:rPr>
+            <w:color w:val="8B0018"/>
+            <w:u w:val="single"/>
+          </w:rPr>
+          <w:t xml:space="preserve">UnderbossHQ-User-Manual.docx</w:t>
+        </w:r>
+      </w:hyperlink>
     </w:p>
     <w:p>
       <w:pPr>

</xml_diff>